<commit_message>
Phase 1 - certifications: ligne propre 'Nom | Organisme | Annee'
- Code: construit cert.line en joignant les champs non vides (sans pays)
- 5 templates: bloc certif remplace par un seul placeholder {{ cert.line }}
  (via python-docx pour gerer la fragmentation des runs)
- Resultat: 'TOEIC | 2026' au lieu de 'TOEIC |  | 2026', plus de separateur orphelin
</commit_message>
<xml_diff>
--- a/TMC_NA_template_EN_Anonymise_Content.docx
+++ b/TMC_NA_template_EN_Anonymise_Content.docx
@@ -781,7 +781,7 @@
           <w:u w:color="033247"/>
           <w:lang w:val="en-IN"/>
         </w:rPr>
-        <w:t xml:space="preserve">{{ cert.name }} │{{ </w:t>
+        <w:t>{{ cert.line }}</w:t>
       </w:r>
       <w:proofErr w:type="spellStart"/>
       <w:r>
@@ -792,7 +792,6 @@
           <w:u w:color="033247"/>
           <w:lang w:val="en-IN"/>
         </w:rPr>
-        <w:t>cert.institution</w:t>
       </w:r>
       <w:proofErr w:type="spellEnd"/>
       <w:r>
@@ -803,7 +802,6 @@
           <w:u w:color="033247"/>
           <w:lang w:val="en-IN"/>
         </w:rPr>
-        <w:t xml:space="preserve"> }} │{% if </w:t>
       </w:r>
       <w:proofErr w:type="spellStart"/>
       <w:r>
@@ -814,7 +812,6 @@
           <w:u w:color="033247"/>
           <w:lang w:val="en-IN"/>
         </w:rPr>
-        <w:t>cert.year</w:t>
       </w:r>
       <w:proofErr w:type="spellEnd"/>
       <w:r>
@@ -825,7 +822,6 @@
           <w:u w:color="033247"/>
           <w:lang w:val="en-IN"/>
         </w:rPr>
-        <w:t xml:space="preserve"> %} {{</w:t>
       </w:r>
       <w:proofErr w:type="spellStart"/>
       <w:r>
@@ -836,7 +832,6 @@
           <w:u w:color="033247"/>
           <w:lang w:val="en-IN"/>
         </w:rPr>
-        <w:t>cert.year</w:t>
       </w:r>
       <w:proofErr w:type="spellEnd"/>
       <w:r>
@@ -847,7 +842,6 @@
           <w:u w:color="033247"/>
           <w:lang w:val="en-IN"/>
         </w:rPr>
-        <w:t xml:space="preserve">}} {% endif %} {{ </w:t>
       </w:r>
       <w:proofErr w:type="spellStart"/>
       <w:r>
@@ -858,7 +852,6 @@
           <w:u w:color="033247"/>
           <w:lang w:val="en-IN"/>
         </w:rPr>
-        <w:t>cert.country</w:t>
       </w:r>
       <w:proofErr w:type="spellEnd"/>
       <w:r>
@@ -869,7 +862,6 @@
           <w:u w:color="033247"/>
           <w:lang w:val="en-IN"/>
         </w:rPr>
-        <w:t xml:space="preserve"> }}</w:t>
       </w:r>
     </w:p>
     <w:p>

</xml_diff>

<commit_message>
Phase 1b - 4 templates restants: meme mise en page corrigee que FR
- Competences visibles (syntaxe RichText) sur EN, FR_Anon, EN_Anon, Content
- Bloc titre/residence/langues sur la page de garde (EN, FR_Anon, EN_Anon)
- Espacement competences resserre
- Page blanche finale supprimee
- Template Content (sans page de garde) : fix competences uniquement
</commit_message>
<xml_diff>
--- a/TMC_NA_template_EN_Anonymise_Content.docx
+++ b/TMC_NA_template_EN_Anonymise_Content.docx
@@ -990,53 +990,48 @@
         <w:rPr>
           <w:szCs w:val="20"/>
         </w:rPr>
-        <w:t xml:space="preserve">{% </w:t>
+        <w:t>{%p for category, skills in skills_categorized_doc %}</w:t>
       </w:r>
       <w:proofErr w:type="spellStart"/>
       <w:r>
         <w:rPr>
           <w:szCs w:val="20"/>
         </w:rPr>
-        <w:t>for</w:t>
       </w:r>
       <w:proofErr w:type="spellEnd"/>
       <w:r>
         <w:rPr>
           <w:szCs w:val="20"/>
         </w:rPr>
-        <w:t xml:space="preserve"> </w:t>
       </w:r>
       <w:proofErr w:type="spellStart"/>
       <w:r>
         <w:rPr>
           <w:szCs w:val="20"/>
         </w:rPr>
-        <w:t>category</w:t>
       </w:r>
       <w:proofErr w:type="spellEnd"/>
       <w:r>
         <w:rPr>
           <w:szCs w:val="20"/>
         </w:rPr>
-        <w:t xml:space="preserve">, skills in </w:t>
       </w:r>
       <w:proofErr w:type="spellStart"/>
       <w:r>
         <w:rPr>
           <w:szCs w:val="20"/>
         </w:rPr>
-        <w:t>skills_categorized_doc</w:t>
       </w:r>
       <w:proofErr w:type="spellEnd"/>
       <w:r>
         <w:rPr>
           <w:szCs w:val="20"/>
         </w:rPr>
-        <w:t xml:space="preserve"> %}</w:t>
       </w:r>
     </w:p>
     <w:p>
       <w:pPr>
+        <w:spacing w:before="120" w:after="0"/>
         <w:rPr>
           <w:szCs w:val="20"/>
         </w:rPr>
@@ -1046,63 +1041,54 @@
         <w:rPr>
           <w:szCs w:val="20"/>
         </w:rPr>
-        <w:t>{{ r</w:t>
+        <w:t>{{r category }}{% for skill in skills %}</w:t>
       </w:r>
       <w:proofErr w:type="gramEnd"/>
       <w:r>
         <w:rPr>
           <w:szCs w:val="20"/>
         </w:rPr>
-        <w:t>(</w:t>
       </w:r>
       <w:proofErr w:type="spellStart"/>
       <w:r>
         <w:rPr>
           <w:szCs w:val="20"/>
         </w:rPr>
-        <w:t>category</w:t>
       </w:r>
       <w:proofErr w:type="spellEnd"/>
       <w:r>
         <w:rPr>
           <w:szCs w:val="20"/>
         </w:rPr>
-        <w:t>) }}</w:t>
       </w:r>
       <w:r>
         <w:rPr>
           <w:szCs w:val="20"/>
         </w:rPr>
-        <w:br/>
-        <w:t xml:space="preserve">{% </w:t>
       </w:r>
       <w:proofErr w:type="spellStart"/>
       <w:r>
         <w:rPr>
           <w:szCs w:val="20"/>
         </w:rPr>
-        <w:t>for</w:t>
       </w:r>
       <w:proofErr w:type="spellEnd"/>
       <w:r>
         <w:rPr>
           <w:szCs w:val="20"/>
         </w:rPr>
-        <w:t xml:space="preserve"> </w:t>
       </w:r>
       <w:proofErr w:type="spellStart"/>
       <w:r>
         <w:rPr>
           <w:szCs w:val="20"/>
         </w:rPr>
-        <w:t>skill</w:t>
       </w:r>
       <w:proofErr w:type="spellEnd"/>
       <w:r>
         <w:rPr>
           <w:szCs w:val="20"/>
         </w:rPr>
-        <w:t xml:space="preserve"> in skills %}</w:t>
       </w:r>
     </w:p>
     <w:p>
@@ -1112,6 +1098,7 @@
           <w:ilvl w:val="0"/>
           <w:numId w:val="33"/>
         </w:numPr>
+        <w:spacing w:before="0" w:after="0"/>
         <w:rPr>
           <w:szCs w:val="20"/>
         </w:rPr>
@@ -1121,21 +1108,19 @@
         <w:rPr>
           <w:szCs w:val="20"/>
         </w:rPr>
-        <w:t>{{ r</w:t>
+        <w:t>{{r skill }}</w:t>
       </w:r>
       <w:proofErr w:type="gramEnd"/>
       <w:r>
         <w:rPr>
           <w:szCs w:val="20"/>
         </w:rPr>
-        <w:t>(</w:t>
       </w:r>
       <w:proofErr w:type="spellStart"/>
       <w:r>
         <w:rPr>
           <w:szCs w:val="20"/>
         </w:rPr>
-        <w:t>skill</w:t>
       </w:r>
       <w:proofErr w:type="spellEnd"/>
       <w:proofErr w:type="gramStart"/>
@@ -1143,14 +1128,12 @@
         <w:rPr>
           <w:szCs w:val="20"/>
         </w:rPr>
-        <w:t>) }</w:t>
       </w:r>
       <w:proofErr w:type="gramEnd"/>
       <w:r>
         <w:rPr>
           <w:szCs w:val="20"/>
         </w:rPr>
-        <w:t>}</w:t>
       </w:r>
     </w:p>
     <w:p>
@@ -1197,21 +1180,19 @@
         <w:rPr>
           <w:szCs w:val="20"/>
         </w:rPr>
-        <w:t xml:space="preserve">{% </w:t>
+        <w:t>{%p endfor %}</w:t>
       </w:r>
       <w:proofErr w:type="spellStart"/>
       <w:r>
         <w:rPr>
           <w:szCs w:val="20"/>
         </w:rPr>
-        <w:t>endfor</w:t>
       </w:r>
       <w:proofErr w:type="spellEnd"/>
       <w:r>
         <w:rPr>
           <w:szCs w:val="20"/>
         </w:rPr>
-        <w:t xml:space="preserve"> %}</w:t>
       </w:r>
     </w:p>
     <w:p>
@@ -2657,20 +2638,6 @@
         </w:tc>
       </w:tr>
     </w:tbl>
-    <w:p>
-      <w:pPr>
-        <w:pStyle w:val="Body"/>
-        <w:rPr>
-          <w:rStyle w:val="PageNumber"/>
-          <w:rFonts w:ascii="Arial" w:hAnsi="Arial"/>
-          <w:b/>
-          <w:bCs/>
-          <w:color w:val="033247"/>
-          <w:u w:color="033247"/>
-          <w:lang w:val="en-CA"/>
-        </w:rPr>
-      </w:pPr>
-    </w:p>
     <w:sectPr>
       <w:headerReference w:type="default" r:id="rId11"/>
       <w:footerReference w:type="even" r:id="rId12"/>

</xml_diff>

<commit_message>
UI CV: compétences collées à la catégorie (retrait du saut de ligne) + retrait du vide sous Environnement
- Template_FR: retrait du <w:br/> dans le paragraphe categorie + retrait du paragraphe vide en fin de cellule d'experience
- EN/FR_Anon/EN_Anon/Content: retrait du paragraphe vide en fin de cellule d'experience (categorie deja propre)
</commit_message>
<xml_diff>
--- a/TMC_NA_template_EN_Anonymise_Content.docx
+++ b/TMC_NA_template_EN_Anonymise_Content.docx
@@ -1930,16 +1930,6 @@
               </w:rPr>
               <w:t>{%p endif %}</w:t>
             </w:r>
-          </w:p>
-          <w:p>
-            <w:pPr>
-              <w:rPr>
-                <w:rFonts w:cs="Arial"/>
-                <w:b w:val="0"/>
-                <w:szCs w:val="20"/>
-                <w:lang w:val="en-US"/>
-              </w:rPr>
-            </w:pPr>
           </w:p>
         </w:tc>
       </w:tr>

</xml_diff>